<commit_message>
docs(orgcomp-series): Phase 5.5 seam — one attestation pipeline for every estate (#1290)
Vol VII Book 04 gains 'One Pipeline, Every Estate — the Phase 5 Seam': the
RedHat-on-AWS estate's control state enters the same attestation loop — the
5.1 emission contract feeds the same SI-2 task stream, the 5.2 assessment
feed ranks in the same RA-5 queue, Security Hub/GuardDuty telemetry lands in
the same Evidence Fabric the KSI emit reads — assessed over the whole estate
on the one CM-8 join key, with no per-cloud OSCAL package or second
scorecard. Cross-reference row added to the Vol III Book 03 Phase 5 contract.
Tracked derivatives re-issued at the new Date Code (pptx via aan-deck, docx
patched in place).

This closes the documentation side of workstream 5.5; the remaining epic
criteria are live-estate execution.

Co-Authored-By: Claude Fable 5 <noreply@anthropic.com>
Claude-Session: https://claude.ai/code/session_01N5UTDTQvE1TzezbTuWtxxZ
</commit_message>
<xml_diff>
--- a/docs/customer-documents/orgcomp-series/Vol_VII_Book_04_OrgComp_Control_Attestation_Evidence_KSI.docx
+++ b/docs/customer-documents/orgcomp-series/Vol_VII_Book_04_OrgComp_Control_Attestation_Evidence_KSI.docx
@@ -31,7 +31,7 @@
         <w:pStyle w:val="Date"/>
       </w:pPr>
       <w:r>
-        <w:t xml:space="preserve">2026-07-12 15:00 ET</w:t>
+        <w:t>2026-07-20 01:20 ET</w:t>
       </w:r>
     </w:p>
     <w:p>
@@ -85,7 +85,7 @@
         <w:t xml:space="preserve"> </w:t>
       </w:r>
       <w:r>
-        <w:t xml:space="preserve">2026-07-12 15:00 ET</w:t>
+        <w:t>2026-07-20 01:20 ET</w:t>
       </w:r>
     </w:p>
     <w:bookmarkEnd w:id="9"/>
@@ -1476,6 +1476,19 @@
       </w:r>
     </w:p>
     <w:bookmarkEnd w:id="24"/>
+    <w:p>
+      <w:pPr>
+        <w:pStyle w:val="Heading1"/>
+      </w:pPr>
+      <w:r>
+        <w:t>One Pipeline, Every Estate — the Phase 5 Seam</w:t>
+      </w:r>
+    </w:p>
+    <w:p>
+      <w:r>
+        <w:t>The attestation loop this book defines is estate-agnostic by construction, and Phase 5 makes that concrete: the RedHat-on-AWS estate's control state enters this same pipeline, not a parallel one. The Patch &amp; Systems Management book's Phase 5 emission contract delivers AWS remediation records into the same SI-2 task stream this book attests over; the AWS assessment feed ranks in the same RA-5 queue; Security Hub and GuardDuty telemetry lands in the same Evidence Fabric the KSI emit reads. An assessed control is assessed over the whole estate keyed to the one CM-8 join key — there is no AWS attestation narrative, no second scorecard, and no per-cloud OSCAL package. That is the epic's closing invariant, and this book is where it holds.</w:t>
+      </w:r>
+    </w:p>
     <w:sectPr>
       <w:footnotePr>
         <w:numRestart w:val="eachSect"/>

</xml_diff>

<commit_message>
docs(orgcomp-series): Phase 5.5 seam — one attestation pipeline for every estate (#1296)
Vol VII Book 04 gains 'One Pipeline, Every Estate — the Phase 5 Seam': the
RedHat-on-AWS estate's control state enters the same attestation loop — the
5.1 emission contract feeds the same SI-2 task stream, the 5.2 assessment
feed ranks in the same RA-5 queue, Security Hub/GuardDuty telemetry lands in
the same Evidence Fabric the KSI emit reads — assessed over the whole estate
on the one CM-8 join key, with no per-cloud OSCAL package or second
scorecard. Cross-reference row added to the Vol III Book 03 Phase 5 contract.
Tracked derivatives re-issued at the new Date Code (pptx via aan-deck, docx
patched in place).

This closes the documentation side of workstream 5.5; the remaining epic
criteria are live-estate execution.


Claude-Session: https://claude.ai/code/session_01N5UTDTQvE1TzezbTuWtxxZ

Co-authored-by: Claude <noreply@anthropic.com>
</commit_message>
<xml_diff>
--- a/docs/customer-documents/orgcomp-series/Vol_VII_Book_04_OrgComp_Control_Attestation_Evidence_KSI.docx
+++ b/docs/customer-documents/orgcomp-series/Vol_VII_Book_04_OrgComp_Control_Attestation_Evidence_KSI.docx
@@ -31,7 +31,7 @@
         <w:pStyle w:val="Date"/>
       </w:pPr>
       <w:r>
-        <w:t xml:space="preserve">2026-07-12 15:00 ET</w:t>
+        <w:t>2026-07-20 01:20 ET</w:t>
       </w:r>
     </w:p>
     <w:p>
@@ -85,7 +85,7 @@
         <w:t xml:space="preserve"> </w:t>
       </w:r>
       <w:r>
-        <w:t xml:space="preserve">2026-07-12 15:00 ET</w:t>
+        <w:t>2026-07-20 01:20 ET</w:t>
       </w:r>
     </w:p>
     <w:bookmarkEnd w:id="9"/>
@@ -1476,6 +1476,19 @@
       </w:r>
     </w:p>
     <w:bookmarkEnd w:id="24"/>
+    <w:p>
+      <w:pPr>
+        <w:pStyle w:val="Heading1"/>
+      </w:pPr>
+      <w:r>
+        <w:t>One Pipeline, Every Estate — the Phase 5 Seam</w:t>
+      </w:r>
+    </w:p>
+    <w:p>
+      <w:r>
+        <w:t>The attestation loop this book defines is estate-agnostic by construction, and Phase 5 makes that concrete: the RedHat-on-AWS estate's control state enters this same pipeline, not a parallel one. The Patch &amp; Systems Management book's Phase 5 emission contract delivers AWS remediation records into the same SI-2 task stream this book attests over; the AWS assessment feed ranks in the same RA-5 queue; Security Hub and GuardDuty telemetry lands in the same Evidence Fabric the KSI emit reads. An assessed control is assessed over the whole estate keyed to the one CM-8 join key — there is no AWS attestation narrative, no second scorecard, and no per-cloud OSCAL package. That is the epic's closing invariant, and this book is where it holds.</w:t>
+      </w:r>
+    </w:p>
     <w:sectPr>
       <w:footnotePr>
         <w:numRestart w:val="eachSect"/>

</xml_diff>